<commit_message>
Deploy preview for PR 115 🛫
</commit_message>
<xml_diff>
--- a/pr-preview/pr-115/vignettes/articles/package-structure.docx
+++ b/pr-preview/pr-115/vignettes/articles/package-structure.docx
@@ -41,6 +41,443 @@
           <w:rStyle w:val="NormalTok"/>
         </w:rPr>
         <w:t xml:space="preserve">(rpt)</w:t>
+      </w:r>
+    </w:p>
+    <w:p>
+      <w:pPr>
+        <w:pStyle w:val="FirstParagraph"/>
+      </w:pPr>
+      <w:r>
+        <w:t xml:space="preserve">$$
+    \providecommand{\cbl}[1]{\mathopen{}\left\{#1\right.}
+    \providecommand{\cb}[1]{\mathopen{}\left\{#1\right\}\mathclose{}}
+    \providecommand{\cbmat}[1]{\mathopen{}\left\{\begin{matrix}#1\end{matrix}\right\}\mathclose{}}
+    \providecommand{\paren}[1]{\mathopen{}\left(#1\right)\mathclose{}}
+    \providecommand{\pmat}[1]{\begin{pmatrix}#1\end{pmatrix}}
+    \providecommand{\sparen}[1]{(#1)}
+    \providecommand{\sb}[1]{\mathopen{}\left[#1\right]\mathclose{}}
+    \def\distop{\operatorname}
+    \providecommand{\sbmat}[1]{\begin{bmatrix}#1\end{bmatrix}}
+    \providecommand{\Prf}[1]{\Pr\paren{#1}}
+    \def\am{\arg \max}
+    \def\argmax{\arg \max}
+    \def\p{\distop{p}}
+    \def\f{\distop{f}}
+    \def\F{\distop{F}}
+    \def\h{\distop{h}}
+    \def\H{\distop{H}}
+    \def\pr{\p}
+    \def\dens{\p}
+    \def\pdens{\p}
+    \def\fdens{\f}
+    \def\mass{\P}
+    \def\pmass{\P}
+    \def\fmass{\F}
+    \def\S{\distop{S}}
+    \providecommand{\Sf}[1]{\S\paren{#1}}
+    \def\surv{\distop{S}}
+    \providecommand{\survf}[1]{\surv\paren{#1}}
+    \def\ph{\mathop{\hat{\p}}\nolimits}
+    \def\P{\distop{P}}
+    \def\hp{\mathop{\hat{\p}}\nolimits}
+    \def\ga{\alpha}
+    \def\a{\alpha}
+    \def\b{\beta}
+    \def\g{\gamma}
+    \providecommand{\floor}[1]{\mathopen{}\left\lfloor#1\right\rfloor\mathclose{}}
+    \providecommand{\ceiling}[1]{\mathopen{}\left\lceil#1\right\rceil\mathclose{}}
+    \providecommand{\ceil}[1]{\mathopen{}\left\lceil#1\right\rceil\mathclose{}}
+    \def\Ber{\operatorname{Ber}}
+    \def\Bernoulli{\operatorname{Bernoulli}}
+    \def\Pois{\operatorname{Pois}}
+    \def\Poisson{\operatorname{Poisson}}
+    \def\Gaus{\operatorname{Gaussian}}
+    \def\Normal{\operatorname{N}}
+    \providecommand{\ndist}[1]{\Normal\paren{#1}}
+    \def\NB{\operatorname{NegBin}}
+    \def\NegBin{\operatorname{NegBin}}
+    \def\vbeta{\vec \beta}
+    \def\vb{\vec \b}
+    \def\v0{\vec{0}}
+    \def\vzero{\vec{0}}
+    \def\gb{\beta}
+    \def\gg{\gamma}
+    \def\gd{\delta}
+    \def\eps{\varepsilon}
+    \def\veps{\vec{\varepsilon}}
+    \providecommand{\epsp}[1]{\eps\paren{#1}}
+    \providecommand{\epsf}[1]{\eps\paren{#1}}
+    \def\om{\omega}
+    \def\m{\mu}
+    \def\mean{\mu}
+    \def\pmean{\mu}
+    \def\popmean{\mu}
+    \def\vm{\vec \m}
+    \def\s{\sigma}
+    \def\l{\lambda}
+    \def\gl{\lambda}
+    \def\lam{\lambda}
+    \def\gs{\sigma}
+    \def\gm{\mu}
+    \def\M{M}
+    \def\gM{M}
+    \def\Mu{M}
+    \def\cd{\cdot}
+    \def\cds{\cdots}
+    \def\lds{\ldots}
+    \def\eqdef{\stackrel{\text{def}}{=}}
+    \def\defeq{\stackrel{\text{def}}{=}}
+    \def\hb{\hat \beta}
+    \def\hvb{\hat{\vb}}
+    \def\hl{\hat \lambda}
+    \def\hy{\hat y}
+    \def\yh{\hat y}
+    \def\V{{\operatorname{Var}}}
+    \def\hs{\hat \sigma}
+    \def\hsig{\hat \sigma}
+    \def\hS{\hat \Sigma}
+    \def\hSig{\hat \Sigma}
+    \def\hSigma{\hat \Sigma}
+    \def\hsurv{\mathop{\hat{\surv}}\nolimits}
+    \def\hSurv{\mathop{\hat{\surv}}\nolimits}
+    \providecommand{\hSurvf}[1]{\hSurv\paren{#1}}
+    \def\dist{\ \sim \ }
+    \def\ddist{\ \dot{\sim} \ }
+    \def\dsim{\ \dot{\sim} \ }
+    \def\za{z_{1 - \frac{\alpha}{2}}}
+    \def\ciradsym{\xi}
+    \def\cirad{\za \cdot \hse{\hb}}
+    \providecommand{\ciradf}[1]{\za \cdot \hse{#1}}
+    \def\ci{\hb {\color{red}\pm} \cirad}
+    \def\th{\theta}
+    \def\vth{\vec{\theta}}
+    \def\Th{\Theta}
+    \def\xbar{\bar{x}}
+    \def\hth{\hat\theta}
+    \def\hthml{\hth_{\text{ML}}}
+    \def\ba{\begin{aligned}}
+    \def\ea{\end{aligned}}
+    \def\ind{\perp\!\!\!\perp}
+    \def\indpt{\ind}
+    \def\indold{⫫}
+    \def\all{\forall}
+    \def\iid{\operatorname{iid}}
+    \def\ciid{\operatorname{ciid}}
+    \def\simind{\ \sim_{\ind}\ }
+    \def\siid{\ \sim_{\iid}\ }
+    \def\sciid{\ \sim_{\ciid}\ }
+    \def\simiid{\siid}
+    \def\distiid{\siid}
+    \def\tf{\therefore}
+    \def\Lik{\mathscr{L}}
+    \def\llik{\ell}
+    \def\loglik{\ell}
+    \def\logl{\ell}
+    \providecommand{\llikf}[1]{\llik \paren{#1}}
+    \def\deviation{e}
+    \def\devn{\deviation}
+    \providecommand{\deviationv}{\vec{\deviation}}
+    \def\devnv{\deviationv}
+    \def\Deviation{E}
+    \def\Devn{\Deviation}
+    \def\residual{r}
+    \def\resid{\residual}
+    \def\Residual{R}
+    \def\Resid{\Residual}
+    \def\stdresidual{r^\prime}
+    \def\stdresid{\stdresidual}
+    \def\StdResidual{R^\prime}
+    \def\StdResid{\StdResidual}
+    \def\modresidual{r^*}
+    \def\modresid{\modresidual}
+    \def\ModResidual{R^*}
+    \def\ModResid{\ModResidual}
+    \def\score{\ell'}
+    \def\scorev{\vec{\ell'}}
+    \def\scorei{\vec{\ell_i'}}
+    \def\scorevi{\vec{\ell_i'}}
+    \providecommand{\scoref}[1]{\score \paren{#1}}
+    \def\hess{\llik''}
+    \def\hessm{\llik''}
+    \def\hessian{\hess}
+    \def\hessij{\llik_{ij}''}
+    \def\hessijalt{\sb{\hess}_{ij}}
+    \providecommand{\hessf}[1]{\hess \paren{#1}}
+    \providecommand{\hessianf}[1]{\hess \paren{#1}}
+    \providecommand{\starf}[1]{#1^*}
+    \def\lik{\ell}
+    \providecommand{\est}[1]{\widehat{#1}}
+    \providecommand{\esttmp}[1]{{\widehat{#1}}^*}
+    \def\esttmpl{\esttmp{\lambda}}
+    \def\cR{\mathcal{R}}
+    \def\range{\mathcal{R}}
+    \def\Range{\mathcal{R}}
+    \providecommand{\rangef}[1]{\cR(#1)}
+    \def\~{\approx}
+    \def\dapp{\dot\approx}
+    \providecommand{\deriv}[1]{\frac{\partial}{\partial #1}}
+    \providecommand{\dderiv}[1]{\frac{\partial^2}{\partial #1^2}}
+    \providecommand{\derivf}[2]{\frac{\partial #1}{\partial #2}}
+    \providecommand{\derivff}[2]{\frac{\partial #2}{\partial #1}}
+    \providecommand{\dderivf}[2]{\frac{\partial^2 #1}{\partial #2^2}}
+    \providecommand{\xderiv}[2]{\frac{\partial^2}{\partial #1 \partial #2}}
+    \providecommand{\xderivf}[3]{\frac{\partial^2 #1}{\partial #2 \partial #3}}
+    \providecommand{\xderivff}[3]{\frac{\partial^2 #3}{\partial #1 \partial #2}}
+    \providecommand{\red}[1]{{\color{red}#1}}
+    \providecommand{\green}[1]{{\color{green}#1}}
+    \providecommand{\blue}[1]{{\color{blue}#1}}
+    \providecommand{\cyan}[1]{{\color{cyan}#1}}
+    \providecommand{\magenta}[1]{{\color{magenta}#1}}
+    \providecommand{\yellow}[1]{{\color{yellow}#1}}
+    \providecommand{\black}[1]{{\color{black}#1}}
+    \providecommand{\gray}[1]{{\color{gray}#1}}
+    \providecommand{\white}[1]{{\color{white}#1}}
+    \providecommand{\darkgray}[1]{{\color{darkgray}#1}}
+    \providecommand{\lightgray}[1]{{\color{lightgray}#1}}
+    \providecommand{\brown}[1]{{\color{brown}#1}}
+    \providecommand{\lime}[1]{{\color{lime}#1}}
+    \providecommand{\olive}[1]{{\color{olive}#1}}
+    \providecommand{\orange}[1]{{\color{orange}#1}}
+    \providecommand{\pink}[1]{{\color{pink}#1}}
+    \providecommand{\purple}[1]{{\color{purple}#1}}
+    \providecommand{\teal}[1]{{\color{teal}#1}}
+    \providecommand{\violet}[1]{{\color{violet}#1}}
+    \providecommand{\hE}[1]{\mathop{\hat{\operatorname{E}}}\nolimits\sb{#1}}
+    \providecommand{\hExp}[1]{\mathop{\hat{\operatorname{E}}}\nolimits\sb{#1}}
+    \providecommand{\hExpf}[1]{\mathop{\hat{\operatorname{E}}}\nolimits\sb{#1}}
+    \def\hmu{\hat{\mu}}
+    \providecommand{\hmuf}[1]{\hmu\paren{#1}}
+    \def\Expp{\distop{E}}
+    \def\Ep{\distop{E}}
+    \def\expit{\operatorname{expit}}
+    \providecommand{\expitf}[1]{\expit\cb{#1}}
+    \providecommand{\dexpitf}[1]{\expit'\cb{#1}}
+    \def\logit{\operatorname{logit}}
+    \providecommand{\logitf}[1]{\logit\cb{#1}}
+    \providecommand{\E}[1]{\distop{E}\sb{#1}}
+    \providecommand{\Ef}[1]{\distop{E}\sb{#1}}
+    \providecommand{\Exp}[1]{\distop{E}\sb{#1}}
+    \providecommand{\Expf}[1]{\distop{E}\sb{#1}}
+    \providecommand{\Expfc}[2]{\distop{E}_{#1}\sb{#2}}
+    \providecommand{\evalAt}[2]{\left.{#1}\right|_{#2}}
+    \def\Varr{\operatorname{Var}}
+    \def\Vart{\operatorname{Var}}
+    \def\hvar{\mathop{\widehat{\Vart}}\nolimits}
+    \def\hvart{\mathop{\widehat{\Vart}}\nolimits}
+    \def\Covt{\operatorname{Cov}}
+    \def\hcovt{\mathop{\widehat{\Covt}}\nolimits}
+    \def\hCovt{\mathop{\widehat{\Covt}}\nolimits}
+    \providecommand{\var}[1]{\operatorname{Var}\paren{#1}}
+    \providecommand{\varf}[1]{\operatorname{Var}\paren{#1}}
+    \providecommand{\Var}[1]{\operatorname{Var}\paren{#1}}
+    \providecommand{\hVar}[1]{\mathop{\widehat{\operatorname{Var}}}\nolimits\paren{#1}}
+    \providecommand{\Varf}[1]{\operatorname{Var}\paren{#1}}
+    \providecommand{\hvarf}[1]{\hvart\paren{#1}}
+    \providecommand{\Cov}[1]{\Covt \paren{#1}}
+    \providecommand{\Covs}[2]{\Covt \paren{#1, #2}}
+    \providecommand{\Covf}[1]{\Covt \paren{#1}}
+    \providecommand{\covh}[1]{\hcovt\paren{#1}}
+    \providecommand{\covhf}[1]{\hcovt\paren{#1}}
+    \providecommand{\hcovf}[1]{\hcovt\paren{#1}}
+    \def\Cort{\operatorname{Cor}}
+    \def\hcort{\mathop{\widehat{\Cort}}\nolimits}
+    \providecommand{\Cor}[1]{\Cort \paren{#1}}
+    \providecommand{\Corf}[1]{\Cort \paren{#1}}
+    \providecommand{\Cors}[2]{\Cort \paren{#1, #2}}
+    \providecommand{\hCor}[1]{\hcort\paren{#1}}
+    \providecommand{\hCorf}[1]{\hcort\paren{#1}}
+    \providecommand{\hCors}[2]{\hcort\paren{#1, #2}}
+    \def\med{\operatorname{med}}
+    \providecommand{\medf}[1]{\med\paren{#1}}
+    \def\IQR{\operatorname{IQR}}
+    \providecommand{\IQRf}[1]{\IQR\paren{#1}}
+    \def\varht{\mathop{\widehat{\operatorname{Var}}}\nolimits}
+    \providecommand{\varh}[1]{\varht\paren{#1}}
+    \providecommand{\varhf}[1]{\varht\paren{#1}}
+    \providecommand{\vc}[1]{\boldsymbol{#1}}
+    \providecommand{\sd}[1]{\operatorname{sd}\paren{#1}}
+    \providecommand{\SD}[1]{\operatorname{SD}\paren{#1}}
+    \providecommand{\hSD}[1]{\mathop{\widehat{\operatorname{SD}}}\nolimits\paren{#1}}
+    \providecommand{\hSDf}[1]{\mathop{\widehat{\operatorname{SD}}}\nolimits\paren{#1}}
+    \providecommand{\se}[1]{\operatorname{se}\paren{#1}}
+    \def\hset{\mathop{\widehat{\operatorname{se}}}\nolimits}
+    \def\hSE{\mathop{\widehat{\operatorname{SE}}}\nolimits}
+    \def\hSEt{\mathop{\widehat{\operatorname{SE}}}\nolimits}
+    \providecommand{\sef}[1]{\operatorname{se}\paren{#1}}
+    \providecommand{\hse}[1]{\hset\paren{#1}}
+    \providecommand{\hsef}[1]{\hset\paren{#1}}
+    \providecommand{\SE}[1]{\operatorname{SE}\paren{#1}}
+    \providecommand{\SEf}[1]{\operatorname{SE}\paren{#1}}
+    \providecommand{\SDf}[1]{\operatorname{SD}\paren{#1}}
+    \providecommand{\HSE}[1]{\hSE\paren{#1}}
+    \providecommand{\hSEf}[1]{\hSE\paren{#1}}
+    \def\logt{\operatorname{log}}
+    \providecommand{\logf}[1]{\logt\cb{#1}}
+    \def\dlog{\logt'}
+    \providecommand{\dlogf}[1]{\dlog \cb{#1}}
+    \renewcommand{\exp}[1]{\operatorname{exp}\cb{#1}}
+    \def\expt{\operatorname{exp}}
+    \providecommand{\expf}[1]{\operatorname{exp}\cb{#1}}
+    \providecommand{\expfn}[1]{\expf{#1}}
+    \def\dexp{\operatorname{exp}'}
+    \providecommand{\dexpf}[1]{\dexp \cb{#1}}
+    \providecommand{\e}[1]{\text{e}^{#1}}
+    \providecommand{\ef}[1]{\text{e}^{#1}}
+    \providecommand{\inv}[1]{\mathopen{}\left(#1\right)^{-1}\mathclose{}}
+    \providecommand{\invf}[1]{\mathopen{}\left(#1\right)^{-1}\mathclose{}}
+    \providecommand{\invp}[1]{\mathopen{}\left(#1\right)^{-1}\mathclose{}}
+    \providecommand{\invcb}[1]{\mathopen{}\left\{#1\right\}^{-1}\mathclose{}}
+    \providecommand{\invsb}[1]{\mathopen{}\left[#1\right]^{-1}\mathclose{}}
+    \def\oinf{I}
+    \def\oinfm{\mat{I}}
+    \def\Nat{\mathbb{N}}
+    \providecommand{\oinff}[1]{\oinf\paren{#1}}
+    \def\einf{\mathcal{I}}
+    \def\EInf{\einf}
+    \def\FInf{\einf}
+    \def\einfm{\mathcal{I}}
+    \providecommand{\einff}[1]{\einf\paren{#1}}
+    \def\heinf{\hat{\einf}}
+    \providecommand{\heinff}[1]{\heinf \paren{#1}}
+    \providecommand{\1}[1]{\text{1}_{#1}}
+    \providecommand{\indic}[1]{\mathbb{1}_{#1}}
+    \providecommand{\indicp}[1]{\mathbb{1}\paren{#1}}
+    \providecommand{\indiccb}[1]{\mathbb{1}\cb{#1}}
+    \providecommand{\indicf}[1]{\mathbb{1}_{#1}}
+    \providecommand{\set}[1]{\cb{#1}}
+    \providecommand{\pf}[1]{\p \paren{#1}}
+    \providecommand{\Pf}[1]{\P \paren{#1}}
+    \providecommand{\Bias}[1]{\operatorname{Bias}\paren{#1}}
+    \providecommand{\bias}[1]{\operatorname{Bias}\paren{#1}}
+    \def\ss{\sigma^2}
+    \providecommand{\ssqf}[1]{\sigma^2\paren{#1}}
+    \providecommand{\mselr}[1]{\operatorname{MSE}\paren{#1}}
+    \providecommand{\maelr}[1]{\operatorname{MAE}\paren{#1}}
+    \providecommand{\abs}[1]{\mathopen{}\left|#1\right|\mathclose{}}
+    \providecommand{\norm}[1]{\mathopen{}\left\lVert#1\right\rVert\mathclose{}}
+    \providecommand{\normsq}[1]{\mathopen{}\left\lVert#1\right\rVert^2\mathclose{}}
+    \providecommand{\sqf}[1]{\mathopen{}\left(#1\right)^2\mathclose{}}
+    \providecommand{\sq}{^2}
+    \def\err{\eps}
+    \providecommand{\erf}[1]{\err\paren{#1}}
+    \renewcommand{\vec}[1]{\tilde{#1}}
+    \providecommand{\vecf}[1]{\tilde{#1}}
+    \providecommand{\v}[1]{\vecf{#1}}
+    \providecommand{\matr}[1]{\mathbf{#1}}
+    \def\mX{\matr{X}}
+    \def\mx{\matr{x}}
+    \def\va{\vecf{a}}
+    \def\vx{\vecf{x}}
+    \def\vxs{{\vec{x}^*}}
+    \def\diff{\Delta}
+    \def\diffvx{\diff\vx}
+    \def\vxi{\vecf{x}_i}
+    \def\vX{\vecf{X}}
+    \def\vy{\vecf{y}}
+    \def\vY{\vecf{Y}}
+    \def\vD{\vecf{D}}
+    \def\vd{\vecf{d}}
+    \def\vT{\vecf{T}}
+    \def\vt{\vecf{t}}
+    \def\v1{\vec{1}}
+    \def\vpi{\vecf{\pi}}
+    \providecommand{\mat}[1]{\mathbf{#1}}
+    \providecommand{\dsn}[1]{#1_1, \ldots, #1_n}
+    \def\X1n{\dsn{X}}
+    \def\Xin{\dsn{X}}
+    \def\x1n{\dsn{x}}
+    \def\y1n{\dsn{y}}
+    \def\'{^{\top}}
+    \providecommand{\pt}[1]{\paren{#1}\'}
+    \providecommand{\tp}[1]{{#1}\'}
+    \def\dpr{\cdot}
+    \def\Xx1n{X_1=x_1, \ldots, X_n = x_n}
+    \providecommand{\dprod}[2]{#1 \cdot #2}
+    \def\dprodf{\dprod}
+    \providecommand{\iprod}[2]{\tp{#1} #2}
+    \def\iprodf{\iprod}
+    \providecommand{\oprod}[2]{#1 \tp{#2}}
+    \providecommand{\siprod}[1]{\tp{#1} #1}
+    \providecommand{\soprod}[1]{#1 \tp{#1}}
+    \providecommand{\sdprod}[1]{\dprod{#1}{#1}}
+    \def\sdprodf{\sdprod}
+    \providecommand{\dsvn}[2]{#1_1=#2_1, \ldots, #1_n = #2_n}
+    \providecommand{\sumn}[1]{\sum_{#1=1}^n}
+    \def\sumin{\sum_{i=1}^n}
+    \def\sumiN{\sum_{i=1}^N}
+    \def\sumip{\sum_{i=1}^p}
+    \def\sumjn{\sum_{j=1}^n}
+    \def\sumjp{\sum_{j=1}^p}
+    \def\sumi1n{\sum_{i=1}^n}
+    \def\prodin{\prod_{i=1}^n}
+    \def\prodi1n{\prod_{i=1}^n}
+    \providecommand{\lp}[2]{#1 \' \beta}
+    \def\odds{\omega}
+    \def\OR{\operatorname{OR}}
+    \def\ror{\theta}
+    \def\logodds{\eta}
+    \providecommand{\logoddsf}[1]{\logodds \paren{#1}}
+    \def\difflogodds{\Delta \eta}
+    \def\hdifflogodds{\widehat{\Delta \eta}}
+    \def\diffeta{\Delta \eta}
+    \def\oddst{\operatorname{odds}}
+    \def\probst{\operatorname{probs}}
+    \def\probt{\operatorname{prob}}
+    \def\riskt{\operatorname{risk}}
+    \def\prob{\pi}
+    \def\probs{\pi}
+    \def\probit{\operatorname{probit}}
+    \providecommand{\oddsf}[1]{\oddst\cb{#1}}
+    \providecommand{\doddsf}[1]{{\oddst}'\cb{#1}}
+    \def\oddsinv{\oddst^{-1}}
+    \def\invodds{\operatorname{invodds}}
+    \providecommand{\oddsinvf}[1]{\oddsinv\cb{#1}}
+    \providecommand{\invoddsf}[1]{\invodds\cb{#1}}
+    \providecommand{\doddsinvf}[1]{{\oddsinv}'\cb{#1}}
+    \providecommand{\dinvoddsf}[1]{{\invodds}'\cb{#1}}
+    \def\rate{{\lambda}}
+    \def\haz{{\lambda}}
+    \def\hazratio{\theta}
+    \def\hr{\theta}
+    \providecommand{\hrf}[1]{\theta\paren{#1}}
+    \def\loghaz{\eta}
+    \def\diffloghaz{\Delta \eta}
+    \def\cuhaz{{\Lambda}}
+    \def\cumhaz{\cuhaz}
+    \def\Surv{\surv}
+    \def\incidence{\bar{\haz}}
+    \def\phaz{\Expf{\haz}}
+    \def\idmat{\mathbb{I}}
+    \def\and{\cap}
+    \def\reglincomb{\vx \cdot \vb}
+    \def\regbetasum{\beta_1 x_1+ \dots + \beta_p x_p}
+    \def\pdf{\distop{f}}
+    \providecommand{\pmf}[1]{\distop{P}\paren{#1}}
+    \def\cdf{\distop{F}}
+    \def\defLik{\Lik(\theta) \eqdef \p(\vX = \vx | \Theta = \theta)}
+    \def\defLogLik{\lik \eqdef \logf{\Lik(\vx|\th)}}
+    \def\defScore{\score \eqdef \deriv{\th} \lik(\vx|\th)}
+    \def\defHess{\hess \eqdef \deriv{\vth}\deriv{\vth\'} \llik(\vx | \vth)}
+    \def\thmHessij{\hessij =
+    \deriv{\th_i}\deriv{\th_j} \llik(\vX = \vx | \vth)}
+    \def\defOInf{\oinf \eqdef -\hess(\vx|\vth)}
+    \def\defEInf{\einf \eqdef \E{\oinf(\vx|\theta)}}
+    \def\thmADistMLE{\hth_{ML}\ \dot \sim\ \ndist{\th,\sb{\einf(\vth)}^{-1}}}
+    \def\eqGLMRatio{\ror(\vx,\vxs) = \exp{(\diffvx) \cdot \vb}}
+    \def\defHR{\hr(t| \vx : \vxs) \eqdef \frac{\haz(t|\vx)}{\haz(t|\vxs)}}
+    \def\kerngaus{\frac{-1}{2}\frac{(x-\mu)^2}{\ss}}
+    \def\likgaus{\paren{2\pi\ss}^{-1/2}\expf{\kerngaus}}
+    \def\llgaus{\frac{-1}{2}\paren{\logf{2\pi\ss} + \frac{\devn^2}{\ss}}}
+    \def\scoreexpf{\frac{\devn}{\Varf{X}}}
+    \def\llexpmean{-\logf{\pmean} - \frac{x}{\pmean}}
+    \def\signt{\operatorname{sign}}
+    \providecommand{\signf}[1]{\signt\cb{#1}}
+    \def\reals{\mathbb{R}}
+    \def\resid{r}
+    \def\stdresid{r'}
+    \def\modresid{r^*}
+    \providecommand{\residv}{\vec{r}}
+    $$</w:t>
       </w:r>
     </w:p>
     <w:bookmarkStart w:id="10" w:name="overview"/>

</xml_diff>